<commit_message>
Shorten BrüMate CV to the last 10 years of experience
Co-Authored-By: Claude Opus 5.5 <noreply@anthropic.com>
Claude-Session: https://claude.ai/code/session_01GqW8cM2soKKzQ2aNFApto7
</commit_message>
<xml_diff>
--- a/Michael_Chuang_CV_BruMate_Graphic_Designer.docx
+++ b/Michael_Chuang_CV_BruMate_Graphic_Designer.docx
@@ -50,7 +50,7 @@
     </w:p>
     <w:p>
       <w:r>
-        <w:t>Hands-on graphic designer based in Denver with 15+ years of experience designing polished marketing assets for consumer brands, including Netflix, STARZ, WOW! Internet, and AstraZeneca. Turns marketing briefs into complete sets of assets across social, email, web, paid digital, and print, and keeps the brand consistent at every touchpoint. Handles the whole process from concept and layout through photo editing, asset rollouts, creative reviews, and print- and web-ready files. Highly proficient in Adobe Creative Suite (Illustrator, Photoshop, InDesign), with After Effects and Premiere Pro for motion and video. Organized, detail-focused, and comfortable handling many projects and deadlines at once, from daily requests to monthly and seasonal campaigns. Works well with Creative Directors, Art Directors, and marketing partners.</w:t>
+        <w:t>Hands-on graphic designer based in Denver with 10+ years of experience designing polished marketing assets for consumer brands, including Netflix, STARZ, WOW! Internet, and AstraZeneca. Turns marketing briefs into complete sets of assets across social, email, web, paid digital, and print, and keeps the brand consistent at every touchpoint. Handles the whole process from concept and layout through photo editing, asset rollouts, creative reviews, and print- and web-ready files. Highly proficient in Adobe Creative Suite (Illustrator, Photoshop, InDesign), with After Effects and Premiere Pro for motion and video. Organized, detail-focused, and comfortable handling many projects and deadlines at once, from daily requests to monthly and seasonal campaigns. Works well with Creative Directors, Art Directors, and marketing partners.</w:t>
       </w:r>
     </w:p>
     <w:p>
@@ -422,33 +422,6 @@
       </w:r>
     </w:p>
     <w:p>
-      <w:r>
-        <w:rPr>
-          <w:b/>
-        </w:rPr>
-        <w:t>Senior Interactive Designer</w:t>
-      </w:r>
-      <w:r>
-        <w:t xml:space="preserve"> | 03/2008 – 06/2012</w:t>
-      </w:r>
-    </w:p>
-    <w:p>
-      <w:pPr>
-        <w:pStyle w:val="ListBullet"/>
-      </w:pPr>
-      <w:r>
-        <w:t>Designed integrated campaign assets across banners, email, social, and web, with close attention to composition and layout.</w:t>
-      </w:r>
-    </w:p>
-    <w:p>
-      <w:pPr>
-        <w:pStyle w:val="ListBullet"/>
-      </w:pPr>
-      <w:r>
-        <w:t>Increased the use of video content, which raised engagement and gave original programming more visibility.</w:t>
-      </w:r>
-    </w:p>
-    <w:p>
       <w:pPr>
         <w:spacing w:before="180" w:after="60"/>
         <w:pBdr>

</xml_diff>

<commit_message>
Fit BrüMate CV to one page
Co-Authored-By: Claude Opus 5.5 <noreply@anthropic.com>
Claude-Session: https://claude.ai/code/session_01GqW8cM2soKKzQ2aNFApto7
</commit_message>
<xml_diff>
--- a/Michael_Chuang_CV_BruMate_Graphic_Designer.docx
+++ b/Michael_Chuang_CV_BruMate_Graphic_Designer.docx
@@ -251,14 +251,6 @@
     </w:p>
     <w:p>
       <w:pPr>
-        <w:pStyle w:val="ListBullet"/>
-      </w:pPr>
-      <w:r>
-        <w:t>Deliver video, social, and digital assets that keep each client's brand consistent across every channel.</w:t>
-      </w:r>
-    </w:p>
-    <w:p>
-      <w:pPr>
         <w:spacing w:before="120"/>
       </w:pPr>
       <w:r>
@@ -291,14 +283,6 @@
       </w:pPr>
       <w:r>
         <w:t>Launched AstraZeneca's first-ever Pinterest campaign (Calquence), creating platform-specific visuals for a new channel.</w:t>
-      </w:r>
-    </w:p>
-    <w:p>
-      <w:pPr>
-        <w:pStyle w:val="ListBullet"/>
-      </w:pPr>
-      <w:r>
-        <w:t>Refreshed the look and content of the Calquence Cares Facebook community to make it more relevant to its audience.</w:t>
       </w:r>
     </w:p>
     <w:p>
@@ -411,14 +395,6 @@
       </w:pPr>
       <w:r>
         <w:t>Managed and mentored a team of 6 designers and developers, running creative reviews and annual performance reviews.</w:t>
-      </w:r>
-    </w:p>
-    <w:p>
-      <w:pPr>
-        <w:pStyle w:val="ListBullet"/>
-      </w:pPr>
-      <w:r>
-        <w:t>Produced presentations and digital collateral for leadership and PR, in line with brand guidelines.</w:t>
       </w:r>
     </w:p>
     <w:p>
@@ -543,29 +519,15 @@
         <w:rPr>
           <w:b/>
         </w:rPr>
-        <w:t>AI &amp; Emerging:</w:t>
+        <w:t>AI &amp; Office:</w:t>
       </w:r>
       <w:r>
-        <w:t xml:space="preserve"> Midjourney · Adobe Firefly · Claude · AI image generation</w:t>
-      </w:r>
-    </w:p>
-    <w:p>
-      <w:pPr>
-        <w:pStyle w:val="ListBullet"/>
-      </w:pPr>
-      <w:r>
-        <w:rPr>
-          <w:b/>
-        </w:rPr>
-        <w:t>Office:</w:t>
-      </w:r>
-      <w:r>
-        <w:t xml:space="preserve"> PowerPoint · Google Slides · Microsoft Office</w:t>
+        <w:t xml:space="preserve"> Midjourney · Adobe Firefly · Claude · PowerPoint · Google Slides · Microsoft Office</w:t>
       </w:r>
     </w:p>
     <w:sectPr>
       <w:pgSz w:w="12240" w:h="15840"/>
-      <w:pgMar w:top="792" w:right="864" w:bottom="792" w:left="864" w:header="720" w:footer="720" w:gutter="0"/>
+      <w:pgMar w:top="648" w:right="792" w:bottom="648" w:left="792" w:header="720" w:footer="720" w:gutter="0"/>
       <w:cols w:space="720"/>
       <w:docGrid w:linePitch="360"/>
     </w:sectPr>
@@ -941,7 +903,7 @@
     </w:pPr>
     <w:rPr>
       <w:rFonts w:ascii="Calibri" w:hAnsi="Calibri"/>
-      <w:sz w:val="20"/>
+      <w:sz w:val="19"/>
     </w:rPr>
   </w:style>
   <w:style w:type="paragraph" w:styleId="Header">
@@ -1472,6 +1434,9 @@
       </w:numPr>
       <w:contextualSpacing/>
     </w:pPr>
+    <w:rPr>
+      <w:sz w:val="19"/>
+    </w:rPr>
   </w:style>
   <w:style w:type="paragraph" w:styleId="ListBullet2">
     <w:name w:val="List Bullet 2"/>

</xml_diff>

<commit_message>
Revert "Shorten BrüMate CV to the last 10 years of experience"
This reverts commit 329d488edda6faa97c877c062a19bd04997b6779.
</commit_message>
<xml_diff>
--- a/Michael_Chuang_CV_BruMate_Graphic_Designer.docx
+++ b/Michael_Chuang_CV_BruMate_Graphic_Designer.docx
@@ -50,7 +50,7 @@
     </w:p>
     <w:p>
       <w:r>
-        <w:t>Hands-on graphic designer based in Denver with 10+ years of experience designing polished marketing assets for consumer brands, including Netflix, STARZ, WOW! Internet, and AstraZeneca. Turns marketing briefs into complete sets of assets across social, email, web, paid digital, and print, and keeps the brand consistent at every touchpoint. Handles the whole process from concept and layout through photo editing, asset rollouts, creative reviews, and print- and web-ready files. Highly proficient in Adobe Creative Suite (Illustrator, Photoshop, InDesign), with After Effects and Premiere Pro for motion and video. Organized, detail-focused, and comfortable handling many projects and deadlines at once, from daily requests to monthly and seasonal campaigns. Works well with Creative Directors, Art Directors, and marketing partners.</w:t>
+        <w:t>Hands-on graphic designer based in Denver with 15+ years of experience designing polished marketing assets for consumer brands, including Netflix, STARZ, WOW! Internet, and AstraZeneca. Turns marketing briefs into complete sets of assets across social, email, web, paid digital, and print, and keeps the brand consistent at every touchpoint. Handles the whole process from concept and layout through photo editing, asset rollouts, creative reviews, and print- and web-ready files. Highly proficient in Adobe Creative Suite (Illustrator, Photoshop, InDesign), with After Effects and Premiere Pro for motion and video. Organized, detail-focused, and comfortable handling many projects and deadlines at once, from daily requests to monthly and seasonal campaigns. Works well with Creative Directors, Art Directors, and marketing partners.</w:t>
       </w:r>
     </w:p>
     <w:p>
@@ -422,6 +422,33 @@
       </w:r>
     </w:p>
     <w:p>
+      <w:r>
+        <w:rPr>
+          <w:b/>
+        </w:rPr>
+        <w:t>Senior Interactive Designer</w:t>
+      </w:r>
+      <w:r>
+        <w:t xml:space="preserve"> | 03/2008 – 06/2012</w:t>
+      </w:r>
+    </w:p>
+    <w:p>
+      <w:pPr>
+        <w:pStyle w:val="ListBullet"/>
+      </w:pPr>
+      <w:r>
+        <w:t>Designed integrated campaign assets across banners, email, social, and web, with close attention to composition and layout.</w:t>
+      </w:r>
+    </w:p>
+    <w:p>
+      <w:pPr>
+        <w:pStyle w:val="ListBullet"/>
+      </w:pPr>
+      <w:r>
+        <w:t>Increased the use of video content, which raised engagement and gave original programming more visibility.</w:t>
+      </w:r>
+    </w:p>
+    <w:p>
       <w:pPr>
         <w:spacing w:before="180" w:after="60"/>
         <w:pBdr>

</xml_diff>

<commit_message>
Revert "Fit BrüMate CV to one page"
This reverts commit fdedc378946e0f2393f849116932e868a1d4c8dc.
</commit_message>
<xml_diff>
--- a/Michael_Chuang_CV_BruMate_Graphic_Designer.docx
+++ b/Michael_Chuang_CV_BruMate_Graphic_Designer.docx
@@ -251,6 +251,14 @@
     </w:p>
     <w:p>
       <w:pPr>
+        <w:pStyle w:val="ListBullet"/>
+      </w:pPr>
+      <w:r>
+        <w:t>Deliver video, social, and digital assets that keep each client's brand consistent across every channel.</w:t>
+      </w:r>
+    </w:p>
+    <w:p>
+      <w:pPr>
         <w:spacing w:before="120"/>
       </w:pPr>
       <w:r>
@@ -283,6 +291,14 @@
       </w:pPr>
       <w:r>
         <w:t>Launched AstraZeneca's first-ever Pinterest campaign (Calquence), creating platform-specific visuals for a new channel.</w:t>
+      </w:r>
+    </w:p>
+    <w:p>
+      <w:pPr>
+        <w:pStyle w:val="ListBullet"/>
+      </w:pPr>
+      <w:r>
+        <w:t>Refreshed the look and content of the Calquence Cares Facebook community to make it more relevant to its audience.</w:t>
       </w:r>
     </w:p>
     <w:p>
@@ -395,6 +411,14 @@
       </w:pPr>
       <w:r>
         <w:t>Managed and mentored a team of 6 designers and developers, running creative reviews and annual performance reviews.</w:t>
+      </w:r>
+    </w:p>
+    <w:p>
+      <w:pPr>
+        <w:pStyle w:val="ListBullet"/>
+      </w:pPr>
+      <w:r>
+        <w:t>Produced presentations and digital collateral for leadership and PR, in line with brand guidelines.</w:t>
       </w:r>
     </w:p>
     <w:p>
@@ -519,15 +543,29 @@
         <w:rPr>
           <w:b/>
         </w:rPr>
-        <w:t>AI &amp; Office:</w:t>
+        <w:t>AI &amp; Emerging:</w:t>
       </w:r>
       <w:r>
-        <w:t xml:space="preserve"> Midjourney · Adobe Firefly · Claude · PowerPoint · Google Slides · Microsoft Office</w:t>
+        <w:t xml:space="preserve"> Midjourney · Adobe Firefly · Claude · AI image generation</w:t>
+      </w:r>
+    </w:p>
+    <w:p>
+      <w:pPr>
+        <w:pStyle w:val="ListBullet"/>
+      </w:pPr>
+      <w:r>
+        <w:rPr>
+          <w:b/>
+        </w:rPr>
+        <w:t>Office:</w:t>
+      </w:r>
+      <w:r>
+        <w:t xml:space="preserve"> PowerPoint · Google Slides · Microsoft Office</w:t>
       </w:r>
     </w:p>
     <w:sectPr>
       <w:pgSz w:w="12240" w:h="15840"/>
-      <w:pgMar w:top="648" w:right="792" w:bottom="648" w:left="792" w:header="720" w:footer="720" w:gutter="0"/>
+      <w:pgMar w:top="792" w:right="864" w:bottom="792" w:left="864" w:header="720" w:footer="720" w:gutter="0"/>
       <w:cols w:space="720"/>
       <w:docGrid w:linePitch="360"/>
     </w:sectPr>
@@ -903,7 +941,7 @@
     </w:pPr>
     <w:rPr>
       <w:rFonts w:ascii="Calibri" w:hAnsi="Calibri"/>
-      <w:sz w:val="19"/>
+      <w:sz w:val="20"/>
     </w:rPr>
   </w:style>
   <w:style w:type="paragraph" w:styleId="Header">
@@ -1434,9 +1472,6 @@
       </w:numPr>
       <w:contextualSpacing/>
     </w:pPr>
-    <w:rPr>
-      <w:sz w:val="19"/>
-    </w:rPr>
   </w:style>
   <w:style w:type="paragraph" w:styleId="ListBullet2">
     <w:name w:val="List Bullet 2"/>

</xml_diff>